<commit_message>
Publish final SOP PS and CV documents
</commit_message>
<xml_diff>
--- a/documents/sop.docx
+++ b/documents/sop.docx
@@ -581,16 +581,16 @@
         <w:snapToGrid w:val="0"/>
         <w:rPr>
           <w:rFonts w:ascii="Trebuchet MS" w:eastAsiaTheme="minorHAnsi" w:hAnsi="Trebuchet MS"/>
-          <w:b/>
-          <w:color w:val="000000" w:themeColor="text1"/>
-          <w:sz w:val="20"/>
-          <w:szCs w:val="20"/>
-        </w:rPr>
-      </w:pPr>
-      <w:r>
-        <w:rPr>
-          <w:rFonts w:ascii="Trebuchet MS" w:eastAsiaTheme="minorHAnsi" w:hAnsi="Trebuchet MS"/>
-          <w:b/>
+          <w:bCs/>
+          <w:color w:val="000000" w:themeColor="text1"/>
+          <w:sz w:val="20"/>
+          <w:szCs w:val="20"/>
+        </w:rPr>
+      </w:pPr>
+      <w:r>
+        <w:rPr>
+          <w:rFonts w:ascii="Trebuchet MS" w:eastAsiaTheme="minorHAnsi" w:hAnsi="Trebuchet MS"/>
+          <w:bCs/>
           <w:color w:val="000000" w:themeColor="text1"/>
           <w:sz w:val="20"/>
           <w:szCs w:val="20"/>
@@ -600,7 +600,7 @@
       <w:r>
         <w:rPr>
           <w:rFonts w:ascii="Trebuchet MS" w:eastAsiaTheme="minorHAnsi" w:hAnsi="Trebuchet MS"/>
-          <w:b/>
+          <w:bCs/>
           <w:color w:val="000000" w:themeColor="text1"/>
           <w:sz w:val="20"/>
           <w:szCs w:val="20"/>
@@ -610,7 +610,7 @@
       <w:r>
         <w:rPr>
           <w:rFonts w:ascii="Trebuchet MS" w:eastAsiaTheme="minorHAnsi" w:hAnsi="Trebuchet MS"/>
-          <w:b/>
+          <w:bCs/>
           <w:color w:val="000000" w:themeColor="text1"/>
           <w:sz w:val="20"/>
           <w:szCs w:val="20"/>
@@ -620,7 +620,7 @@
       <w:r>
         <w:rPr>
           <w:rFonts w:ascii="Trebuchet MS" w:eastAsiaTheme="minorHAnsi" w:hAnsi="Trebuchet MS"/>
-          <w:b/>
+          <w:bCs/>
           <w:color w:val="000000" w:themeColor="text1"/>
           <w:sz w:val="20"/>
           <w:szCs w:val="20"/>
@@ -630,7 +630,7 @@
       <w:r>
         <w:rPr>
           <w:rFonts w:ascii="Trebuchet MS" w:eastAsiaTheme="minorHAnsi" w:hAnsi="Trebuchet MS"/>
-          <w:b/>
+          <w:bCs/>
           <w:color w:val="000000" w:themeColor="text1"/>
           <w:sz w:val="20"/>
           <w:szCs w:val="20"/>
@@ -640,7 +640,7 @@
       <w:r>
         <w:rPr>
           <w:rFonts w:ascii="Trebuchet MS" w:eastAsiaTheme="minorHAnsi" w:hAnsi="Trebuchet MS"/>
-          <w:b/>
+          <w:bCs/>
           <w:color w:val="000000" w:themeColor="text1"/>
           <w:sz w:val="20"/>
           <w:szCs w:val="20"/>
@@ -650,7 +650,7 @@
       <w:r>
         <w:rPr>
           <w:rFonts w:ascii="Trebuchet MS" w:eastAsiaTheme="minorHAnsi" w:hAnsi="Trebuchet MS"/>
-          <w:b/>
+          <w:bCs/>
           <w:color w:val="000000" w:themeColor="text1"/>
           <w:sz w:val="20"/>
           <w:szCs w:val="20"/>
@@ -660,7 +660,7 @@
       <w:r>
         <w:rPr>
           <w:rFonts w:ascii="Trebuchet MS" w:eastAsiaTheme="minorHAnsi" w:hAnsi="Trebuchet MS"/>
-          <w:b/>
+          <w:bCs/>
           <w:color w:val="000000" w:themeColor="text1"/>
           <w:sz w:val="20"/>
           <w:szCs w:val="20"/>
@@ -671,7 +671,7 @@
       <w:r>
         <w:rPr>
           <w:rFonts w:ascii="Trebuchet MS" w:eastAsiaTheme="minorHAnsi" w:hAnsi="Trebuchet MS"/>
-          <w:b/>
+          <w:bCs/>
           <w:color w:val="000000" w:themeColor="text1"/>
           <w:sz w:val="20"/>
           <w:szCs w:val="20"/>
@@ -682,7 +682,7 @@
       <w:r>
         <w:rPr>
           <w:rFonts w:ascii="Trebuchet MS" w:eastAsiaTheme="minorHAnsi" w:hAnsi="Trebuchet MS"/>
-          <w:b/>
+          <w:bCs/>
           <w:color w:val="000000" w:themeColor="text1"/>
           <w:sz w:val="20"/>
           <w:szCs w:val="20"/>
@@ -693,7 +693,7 @@
     <w:p>
       <w:pPr>
         <w:rPr>
-          <w:rFonts w:ascii="Trebuchet MS" w:hAnsi="Trebuchet MS" w:hint="eastAsia"/>
+          <w:rFonts w:ascii="Trebuchet MS" w:hAnsi="Trebuchet MS"/>
           <w:color w:val="000000" w:themeColor="text1"/>
           <w:sz w:val="20"/>
           <w:szCs w:val="20"/>

</xml_diff>